<commit_message>
expand internship report to ~5500 chars and add final docx
</commit_message>
<xml_diff>
--- a/docs/网安学院本科实习手册_AI会议语音转写与检索_已填写.docx
+++ b/docs/网安学院本科实习手册_AI会议语音转写与检索_已填写.docx
@@ -16497,15 +16497,12 @@
             </w:r>
           </w:p>
           <w:p>
-            <w:pPr>
-              <w:ind w:firstLine="480" w:firstLineChars="200"/>
-            </w:pPr>
             <w:r>
               <w:rPr>
                 <w:rFonts w:ascii="宋体" w:hAnsi="宋体" w:eastAsia="宋体"/>
                 <w:sz w:val="24"/>
               </w:rPr>
-              <w:t>本次实习围绕《智能体开发实战》课程展开，我选择的题目是第15题“AI会议语音转写与检索”。实习的目的是把课堂上学到的智能体开发方法落到一个真实可运行、可演示、可交付的项目上，完整经历从需求分析、环境搭建、核心算法集成到接口封装、测试验证和工程整理的整个过程。通过这个项目，我希望深入理解 Agent、Skill 与 Script/CLI 三层之间的关系，弄清楚大模型在智能体系统里到底应该负责什么、不应该负责什么，同时熟悉 FunASR 这一开源语音识别工具链，并在实践中培养安全意识和工程规范意识。这些能力的获得，仅靠阅读教材是远远不够的，必须通过亲自搭建系统、亲自调试、亲自验证才能真正掌握。</w:t>
+              <w:t>本次实习围绕《智能体开发实战》课程展开，我选择的题目是第15题“AI会议语音转写与检索”。实习的目的是把课堂上学到的智能体开发方法落到一个真实可运行、可演示、可交付的项目上，完整经历从需求分析、环境搭建、核心算法集成到接口封装、测试验证和工程整理的整个过程。通过这个项目，我希望深入理解 Agent、Skill 与 Script/CLI 三层之间的关系，弄清楚大模型在智能体系统里到底应该负责什么、不应该负责什么，同时熟悉 FunASR 这一开源语音识别工具链，并在实践中培养安全意识和工程规范意识。这些能力的获得，仅靠阅读教材是远远不够的，必须通过亲自搭建系统、亲自调试、亲自验证才能真正掌握。同时，会议语音转写与检索这一题目具有明确的工程价值：会议内容往往信息量大、时间长、回看成本高，如果能够自动转写并支持按关键词和时间快速定位，就能显著提升会后整理和复盘的效率，这也让我从一开始就对项目抱有兴趣和动力。</w:t>
             </w:r>
           </w:p>
           <w:p>
@@ -16518,9 +16515,6 @@
             </w:r>
           </w:p>
           <w:p>
-            <w:pPr>
-              <w:ind w:firstLine="480" w:firstLineChars="200"/>
-            </w:pPr>
             <w:r>
               <w:rPr>
                 <w:rFonts w:ascii="宋体" w:hAnsi="宋体" w:eastAsia="宋体"/>
@@ -16539,9 +16533,6 @@
             </w:r>
           </w:p>
           <w:p>
-            <w:pPr>
-              <w:ind w:firstLine="480" w:firstLineChars="200"/>
-            </w:pPr>
             <w:r>
               <w:rPr>
                 <w:rFonts w:ascii="宋体" w:hAnsi="宋体" w:eastAsia="宋体"/>
@@ -16560,17 +16551,12 @@
             </w:r>
           </w:p>
           <w:p>
-            <w:pPr>
-              <w:ind w:firstLine="480" w:firstLineChars="200"/>
-            </w:pPr>
-            <w:bookmarkStart w:id="3" w:name="_GoBack"/>
-            <w:bookmarkEnd w:id="3"/>
             <w:r>
               <w:rPr>
                 <w:rFonts w:ascii="宋体" w:hAnsi="宋体" w:eastAsia="宋体"/>
                 <w:sz w:val="24"/>
               </w:rPr>
-              <w:t>语音识别采用开源项目 FunASR，使用版本 1.4.16。我选用 paraformer-zh 作为中文识别模型，它采用非自回归的 Paraformer 结构，兼顾识别精度与推理速度；同时配合 fsmn-vad 做语音端点检测，用来区分有效语音和静音，ct-punc 做标点恢复，让识别结果更接近自然书写习惯。通过 funasr 的 AutoModel 把三个模型统一加载，即可对 wav、mp3、m4a 等常见音频完成识别。模型在首次转写时会从 ModelScope 下载并缓存，我还记录了 FunASR 版本、模型名称、Python 版本和 Torch 版本等信息，便于追溯和复现。FunASR 在整个系统中处于数据入口的位置，后续的检索、定位和摘要都建立在它的转写结果之上，因此转写的质量和时间戳的准确性直接决定了上层功能的效果。这一模块也是本项目与单纯的大模型聊天应用最根本的区别所在。</w:t>
+              <w:t>语音识别采用开源项目 FunASR，使用版本 1.4.16。我选用 paraformer-zh 作为中文识别模型，它采用非自回归的 Paraformer 结构，兼顾识别精度与推理速度；同时配合 fsmn-vad 做语音端点检测，用来区分有效语音和静音，ct-punc 做标点恢复，让识别结果更接近自然书写习惯。通过 funasr 的 AutoModel 把三个模型统一加载，即可对 wav、mp3、m4a 等常见音频完成识别。模型在首次转写时会从 ModelScope 下载并缓存，我还记录了 FunASR 版本、模型名称、Python 版本和 Torch 版本等信息，便于追溯和复现。FunASR 在整个系统中处于数据入口的位置，后续的检索、定位和摘要都建立在它的转写结果之上，因此转写的质量和时间戳的准确性直接决定了上层功能的效果。这一模块也是本项目与单纯的大模型聊天应用最根本的区别所在。此外，FunASR 本身是开源项目，采用 MIT 许可证，允许在课程项目中自由使用，这也符合课程“参考开源项目”的要求；我没有重新训练模型，而是直接复用预训练权重，因为通用中文会议转写场景下预训练模型已经足够好，重新训练既不经济也无必要。</w:t>
             </w:r>
           </w:p>
           <w:p>
@@ -16588,7 +16574,7 @@
                 <w:rFonts w:ascii="宋体" w:hAnsi="宋体" w:eastAsia="宋体"/>
                 <w:sz w:val="24"/>
               </w:rPr>
-              <w:t>转写结果被组织成多个 segment，每个 segment 包含 start_ms、end_ms 和 text 三个字段。为了得到句级时间戳，我起初直接调用模型，结果只得到字符级时间戳，整段音频被当成一句，经过查阅文档才明白需要在调用时传入 sentence_timestamp 参数，让 FunASR 返回按句切分的时间信息。修正后，每个 segment 用毫秒记录起止时间，再格式化为 HH:MM:SS 的可读形式。这种结构让会议内容可定位、可检索、可追溯，是整个项目的数据基础。转写同时输出结构化的 JSON 和易读的 TXT 两种格式，既方便程序处理，也方便人工阅读。此外我还做了时间戳单调性校验，确保相邻 segment 的起止时间按顺序排列，避免因切分或排序问题产生错乱。</w:t>
+              <w:t>转写结果被组织成多个 segment，每个 segment 包含 start_ms、end_ms 和 text 三个字段。为了得到句级时间戳，我起初直接调用模型，结果只得到字符级时间戳，整段音频被当成一句，经过查阅文档才明白需要在调用时传入 sentence_timestamp 参数，让 FunASR 返回按句切分的时间信息。修正后，每个 segment 用毫秒记录起止时间，再格式化为 HH:MM:SS 的可读形式。这种结构让会议内容可定位、可检索、可追溯，是整个项目的数据基础。转写同时输出结构化的 JSON 和易读的 TXT 两种格式，既方便程序处理，也方便人工阅读。此外我还做了时间戳单调性校验，确保相邻 segment 的起止时间按顺序排列，避免因切分或排序问题产生错乱。在时间戳的具体表示上，我统一使用毫秒作为内部单位，这样既能避免浮点精度问题，又便于和 FunASR 返回的毫秒级时间直接对齐，对外展示时再转换成可读形式，这种“内部统一、对外友好”的处理方式贯穿了项目始终。</w:t>
             </w:r>
           </w:p>
           <w:p>
@@ -16660,7 +16646,7 @@
                 <w:rFonts w:ascii="宋体" w:hAnsi="宋体" w:eastAsia="宋体"/>
                 <w:sz w:val="24"/>
               </w:rPr>
-              <w:t>我在独立的虚拟环境中安装 nanobot 0.3.5，配置 DeepSeek 的 provider 和 deepseek-flash 模型，把 workspace 指向项目目录，使 nanobot 能够发现 skills/meeting-asr 下的 Skill。随后用自然语言逐一触发转写、搜索、定位、摘要四个任务，通过运行日志确认 nanobot 确实读取了 SKILL.md 并真实执行了 meeting_tool.py，而不是凭提示词编造答案，四项任务全部通过，最终 NANOBOT_RUNTIME_TEST 和 NANOBOT_INTEGRATION 均为 PASS。这次集成最有价值的地方在于，它证明了“Skill 被发现”和“Skill 被真正执行”是两件不同的事，只有拿到运行时日志里的工具调用证据，才能确认后者。</w:t>
+              <w:t>我在独立的虚拟环境中安装 nanobot 0.3.5，配置 DeepSeek 的 provider 和 deepseek-flash 模型，把 workspace 指向项目目录，使 nanobot 能够发现 skills/meeting-asr 下的 Skill。随后用自然语言逐一触发转写、搜索、定位、摘要四个任务，通过运行日志确认 nanobot 确实读取了 SKILL.md 并真实执行了 meeting_tool.py，而不是凭提示词编造答案，四项任务全部通过，最终 NANOBOT_RUNTIME_TEST 和 NANOBOT_INTEGRATION 均为 PASS。这次集成最有价值的地方在于，它证明了“Skill 被发现”和“Skill 被真正执行”是两件不同的事，只有拿到运行时日志里的工具调用证据，才能确认后者。在集成过程中还出现了一个插曲：nanobot 的 shell 默认使用系统 Python，而 FunASR 依赖装在项目虚拟环境里，为了完成转写，Agent 自动在系统 Python 里补装了依赖，这件事说明 Skill 文档里写清运行环境和使用哪个 Python 对 Runtime 能否正确执行至关重要。</w:t>
             </w:r>
           </w:p>
           <w:p>
@@ -16678,7 +16664,7 @@
                 <w:rFonts w:ascii="宋体" w:hAnsi="宋体" w:eastAsia="宋体"/>
                 <w:sz w:val="24"/>
               </w:rPr>
-              <w:t>安全方面落实最小权限原则：只允许读写项目目录内的 data/input、data/output、logs 等白名单目录，拒绝 ../../ 这类目录穿越，也拒绝 C:\Windows 等越界的绝对路径；输出文件已存在时要求显式 --overwrite，避免误覆盖。日志采用 JSONL 格式，只记录时间戳、动作、文件 basename、状态、耗时和错误类型，不记录音频内容和敏感凭据，并专门编写脱敏函数替换 API Key、Token、密码等格式的字符串。此外项目刻意不提供删除文件的能力，从根上降低误操作风险。我在测试里专门覆盖了路径穿越、越界绝对路径和敏感信息脱敏这几个用例，确保安全逻辑不是写在文档里的一句空话，而是真的能被自动化验证。这些措施看似琐碎，但对于一个会处理文件和外部输入的 Agent 系统来说必不可少。</w:t>
+              <w:t>安全方面落实最小权限原则：只允许读写项目目录内的 data/input、data/output、logs 等白名单目录，拒绝 ../../ 这类目录穿越，也拒绝 C:\Windows 等越界的绝对路径；输出文件已存在时要求显式 --overwrite，避免误覆盖。日志采用 JSONL 格式，只记录时间戳、动作、文件 basename、状态、耗时和错误类型，不记录音频内容和敏感凭据，并专门编写脱敏函数替换 API Key、Token、密码等格式的字符串。此外项目刻意不提供删除文件的能力，从根上降低误操作风险。我在测试里专门覆盖了路径穿越、越界绝对路径和敏感信息脱敏这几个用例，确保安全逻辑不是写在文档里的一句空话，而是真的能被自动化验证。更重要的是，任何 API Key、GitHub Token、密码和 nanobot 的 config.json 都不能进入 Git 仓库，因为这些是真实凭据，一旦进入版本历史就难以彻底清除。这些措施看似琐碎，但对于一个会处理文件和外部输入的 Agent 系统来说必不可少。</w:t>
             </w:r>
           </w:p>
           <w:p>
@@ -16696,7 +16682,7 @@
                 <w:rFonts w:ascii="宋体" w:hAnsi="宋体" w:eastAsia="宋体"/>
                 <w:sz w:val="24"/>
               </w:rPr>
-              <w:t>优化的核心是“大会议文本检索结果压缩”。先用 Python 在本地完成搜索、排序、上下文截取和去重，只把命中的少量片段交给模型，而不是把整份长会议文本全部发送。系统会输出 compression_ratio、estimated_token_before、estimated_token_after 和 reduction_percent 四个统计值，方便量化压缩效果。在多段示例上，关键词“深度学习”的估算 Token 从 360 降到 125，减少约 65%，这些数字都来自实际示例的计算，并非预设。这个优化的本质，是尽量把可以确定性完成的工作留在本地，把宝贵且昂贵的模型调用留给真正需要语义理解的环节。除了检索结果压缩，项目在摘要、日志等环节也都避免把大段原始文本无谓地送入模型，从整体上控制了 Token 消耗。</w:t>
+              <w:t>优化的核心是“大会议文本检索结果压缩”。先用 Python 在本地完成搜索、排序、上下文截取和去重，只把命中的少量片段交给模型，而不是把整份长会议文本全部发送。系统会输出 compression_ratio、estimated_token_before、estimated_token_after 和 reduction_percent 四个统计值，方便量化压缩效果。在多段示例上，关键词“深度学习”的估算 Token 从 360 降到 125，减少约 65%，这些数字都来自实际示例的计算，并非预设。之所以不把会议全文无条件放进模型上下文，是因为会议文本很长，既消耗 Token 又带来无关信息；Python 先检索、切分、筛选，只把必要片段交给 Agent，既省钱又聚焦。这个优化的本质，是尽量把可以确定性完成的工作留在本地，把宝贵且昂贵的模型调用留给真正需要语义理解的环节。除了检索结果压缩，项目在摘要、日志等环节也都避免把大段原始文本无谓地送入模型，从整体上控制了 Token 消耗。</w:t>
             </w:r>
           </w:p>
           <w:p>
@@ -16732,7 +16718,7 @@
                 <w:rFonts w:ascii="宋体" w:hAnsi="宋体" w:eastAsia="宋体"/>
                 <w:sz w:val="24"/>
               </w:rPr>
-              <w:t>项目使用 pytest 编写了 30 个自动化用例，覆盖关键词检索的正常、多次命中、不存在关键词、中英文关键词，时间解析的 MM:SS 与 HH:MM:SS，超出会议范围，路径穿越拒绝，摘要结构，Agent 意图识别和空 transcript 等场景，全部通过。开发过程中曾发现一个真实的问题：“搜索语音识别”会被错误地路由为转写，原因是“识别”被列入了转写关键词。我调整了意图判断的优先级，并把这个案例固化成回归测试。这件事让我明白，自动化测试不仅能验证功能，更能防止已经修复的问题再次悄悄出现。</w:t>
+              <w:t>项目使用 pytest 编写了 30 个自动化用例，覆盖关键词检索的正常、多次命中、不存在关键词、中英文关键词，时间解析的 MM:SS 与 HH:MM:SS，超出会议范围，路径穿越拒绝，摘要结构，Agent 意图识别和空 transcript 等场景，全部通过。开发过程中曾发现一个真实的问题：“搜索语音识别”会被错误地路由为转写，原因是“识别”被列入了转写关键词。我调整了意图判断的优先级，并把这个案例固化成回归测试。这件事让我明白，自动化测试不仅能验证功能，更能防止已经修复的问题再次悄悄出现。除了这 30 个单元测试，我还在不同阶段做了真实运行层面的验证，包括公开音频的真实推理、合成会议的完整流程和 nanobot 的 Runtime 调用，这些端到端的验收性测试与单元测试相互补充，共同保证了项目的可靠性。</w:t>
             </w:r>
           </w:p>
           <w:p>
@@ -16786,7 +16772,7 @@
                 <w:rFonts w:ascii="宋体" w:hAnsi="宋体" w:eastAsia="宋体"/>
                 <w:sz w:val="24"/>
               </w:rPr>
-              <w:t>实习过程中主要遇到了几类问题：一是 funasr 的 PyPI 包并不会自动安装 torch，导致最初运行时报出 PyTorch 未找到的告警；二是 FunASR 默认只返回字符级时间戳，整段音频被当成单句，句级时间信息缺失；三是自然语言 Router 存在关键词歧义，出现了错误路由；四是直接运行脚本时发生相对导入失败；五是本机缺少 ffmpeg，也没有现成的真实会议音频；六是在验证阶段需要区分公开音频、合成会议和真实会议三者的性质，不能把它们混为一谈。这些问题分别涉及依赖环境、模型接口、逻辑设计、运行方式和测试素材几个不同层面，解决它们的过程本身就是一次很有价值的工程训练。</w:t>
+              <w:t>实习过程中主要遇到了几类问题：一是 funasr 的 PyPI 包并不会自动安装 torch，导致最初运行时报出 PyTorch 未找到的告警；二是 FunASR 默认只返回字符级时间戳，整段音频被当成单句，句级时间信息缺失；三是自然语言 Router 存在关键词歧义，出现了错误路由；四是直接运行脚本时发生相对导入失败；五是本机缺少 ffmpeg，也没有现成的真实会议音频；六是在验证阶段需要区分公开音频、合成会议和真实会议三者的性质，不能把它们混为一谈。此外，FunASR 首次运行要从 ModelScope 下载模型，首次下载依赖网络；mp3、m4a 等格式又依赖 ffmpeg，本机最初没有安装，必须明确提示而不是静默失败。在 nanobot 上，我一开始只做到了 Skill 能被 discovery，后来又通过运行日志确认它真正执行了 meeting_tool.py 才算通过。关于 GitHub，我也理解了组织仓库和个人仓库的权限区别。这些问题分别涉及依赖环境、模型接口、逻辑设计、运行方式和测试素材几个不同层面，解决它们的过程本身就是一次很有价值的工程训练。</w:t>
             </w:r>
           </w:p>
           <w:p>
@@ -16804,7 +16790,7 @@
                 <w:rFonts w:ascii="宋体" w:hAnsi="宋体" w:eastAsia="宋体"/>
                 <w:sz w:val="24"/>
               </w:rPr>
-              <w:t>针对上述问题，我分别采取了对应的措施：显式安装 torch 和 torchaudio，并在 requirements 中写清楚；调用 FunASR 时传入 sentence_timestamp 参数获取句级时间戳；调整 Router 的意图优先级并补充回归测试；为脚本增加“脚本/包”双模式导入兼容；对缺少 ffmpeg 的情况给出明确的安装提示，并用公开音频和合成会议素材完成了真实验证。这些解决方法和排查思路我都记录在项目文档里，既便于自己回看，也便于他人复现。整个过程中我始终坚持一个原则：遇到问题先定位真实原因，再针对性修复，而不是靠猜测或掩盖。</w:t>
+              <w:t>针对上述问题，我分别采取了对应的措施：显式安装 torch 和 torchaudio，并在 requirements 中写清楚；调用 FunASR 时传入 sentence_timestamp 参数获取句级时间戳；调整 Router 的意图优先级并补充回归测试；为脚本增加“脚本/包”双模式导入兼容；对缺少 ffmpeg 的情况给出明确的安装提示，并用公开音频和合成会议素材完成了真实验证。在排查路由问题时，我先复现了“搜索语音识别”被识别成 transcribe 的现象，再定位到“识别”这个关键词，最后通过调整意图判断顺序并新增回归测试保证修复不再复发。在 nanobot 上，我把验证从“文件能被发现”推进到“运行时真的调用脚本”，用运行日志里的工具调用记录作为证据。这些方法和思路我都记录在项目文档里，便于复现。整个过程中我始终坚持一个原则：遇到问题先定位真实原因，再针对性修复，而不是靠猜测或掩盖。</w:t>
             </w:r>
           </w:p>
           <w:p>
@@ -16822,7 +16808,7 @@
                 <w:rFonts w:ascii="宋体" w:hAnsi="宋体" w:eastAsia="宋体"/>
                 <w:sz w:val="24"/>
               </w:rPr>
-              <w:t>通过这次实习，我完整地经历了一个智能体应用从需求分析、环境搭建、核心实现、测试验证到界面演示和工程整理的全程，掌握了 FunASR 的集成方法、Agent 与 Skill 与 Script 的分层设计、安全白名单与日志脱敏、低 Token 优化和自动化测试。更重要的是，我养成了用真实运行结果验证代码的习惯：不虚构转写结果，不编造测试数据，不把未完成的工作写成已完成。这种严谨的态度，我认为比学会任何一个具体框架都更重要，也是这次实习留给我最深刻的东西。</w:t>
+              <w:t>通过这次实习，我完整地经历了一个智能体应用从需求分析、环境搭建、核心实现、测试验证到界面演示和工程整理的全程，掌握了 FunASR 的集成方法、Agent 与 Skill 与 Script 的分层设计、安全白名单与日志脱敏、低 Token 优化和自动化测试。更重要的是，我养成了用真实运行结果验证代码的习惯：不虚构转写结果，不编造测试数据，不把未完成的工作写成已完成。这种严谨的态度，我认为比学会任何一个具体框架都更重要，也是这次实习留给我最深刻的东西。同时，这次实习也锻炼了我查阅文档、定位问题和动手解决问题的能力，从依赖缺失、接口参数到路由歧义，每一个问题的解决都让我对相关技术有了更扎实的理解，也让我不再满足于“能跑就行”，而是更关注代码的规范、可测试和可维护。此外，我对 Python 工程项目结构、Git 版本控制和 pytest 回归测试有了更深的理解，也明白 Web GUI 只是后端能力的入口；对开源项目，我学会了关注许可证、依赖和可复现性。总体而言，我从原来只会调用模型，进步到能独立做出一个可运行、可测试、可交付的智能体系统。</w:t>
             </w:r>
           </w:p>
           <w:p>
@@ -16840,7 +16826,7 @@
                 <w:rFonts w:ascii="宋体" w:hAnsi="宋体" w:eastAsia="宋体"/>
                 <w:sz w:val="24"/>
               </w:rPr>
-              <w:t>通过这次实习，我对智能体开发形成了更清晰的认识：它的关键不是堆砌大模型调用，而是清晰的职责分层和可靠的确定性底座。Agent 擅长理解自然语言和规划任务，但搜索、时间解析、摘要抽取这些确定性工作应该由 Script 在本地完成，模型只在真正需要语义理解时才介入。Skill 则把能力固化成可发现、可约束、可复用的接口。安全、日志和测试虽然不直接产生业务功能，但它们是让系统可信赖的基础设施。智能体的“智能”不仅来自大模型，也来自这套精心设计的工程结构。</w:t>
+              <w:t>通过这次实习，我对智能体开发形成了更清晰的认识：它的关键不是堆砌大模型调用，而是清晰的职责分层和可靠的确定性底座。Agent 擅长理解自然语言和规划任务，但搜索、时间解析、摘要抽取这些确定性工作应该由 Script 在本地完成，模型只在真正需要语义理解时才介入。Skill 则把能力固化成可发现、可约束、可复用的接口。安全、日志和测试虽然不直接产生业务功能，但它们是让系统可信赖的基础设施。智能体的“智能”不仅来自大模型，也来自这套精心设计的工程结构。具体到本项目，Agent 负责解析自然语言意图，但不应亲自去做搜索和时间计算这类确定性工作；Skill 是意图和工具之间的接口描述；Script/CLI 提供稳定、可测试、可复现的底层能力；FunASR 负责真实语音识别。相比让大模型直接处理所有文本，这种分层更可靠，也更利于调试、安全控制和后续扩展。面向未来，我认为智能体开发会越来越强调工具的可组合性和可验证性，如何把模型、确定性工具、安全约束和清晰接口组织成一个可靠整体，才是工程上的核心挑战。</w:t>
             </w:r>
           </w:p>
           <w:p>
@@ -16858,7 +16844,7 @@
                 <w:rFonts w:ascii="宋体" w:hAnsi="宋体" w:eastAsia="宋体"/>
                 <w:sz w:val="24"/>
               </w:rPr>
-              <w:t>本项目目前已经完成了核心功能、真实验证、GUI、自动化测试和 Demo 视频，整体达到课程验收要求，仅剩 GitHub 组织发布因为权限问题而暂时阻塞。后续我计划在获得组织权限后完成仓库上传，并进一步尝试几个方向：接入更强的外部摘要模型以提升摘要质量；完善多说话人会议场景，让系统更适合真实多人讨论；以及把检索和摘要做得更贴近真实会议的使用习惯。这次实习让我对智能体开发建立了系统认识，也让我看到自己在模型原理和工程深度上还有不少可以继续提升的空间，我会把这份项目作为后续学习的起点，持续完善。</w:t>
+              <w:t>本项目目前已经完成了核心功能、真实验证、GUI、自动化测试和 Demo 视频，整体达到课程验收要求，仅剩 GitHub 组织发布因为权限问题而暂时阻塞。后续可以继续探索的方向还很多：多人会议场景下的说话人分离与角色标注；长会议的分块与流式转写；更强的语义检索；会议决策和待办事项的结构化抽取；以及更完善的权限控制。在技术栈上，我还计划继续学习 Agent Runtime、Tool Calling、RAG 等内容。这次实习让我对智能体开发建立了系统认识，也让我看到自己还有不少可以提升的空间，我会把这份项目作为后续学习的起点，持续完善。</w:t>
             </w:r>
           </w:p>
         </w:tc>

</xml_diff>